<commit_message>
Lynch: 75-100mg ASS, Punkt 4 Pankreas-Risiko
</commit_message>
<xml_diff>
--- a/Lynch_Arztbrief_Textbausteine.docx
+++ b/Lynch_Arztbrief_Textbausteine.docx
@@ -92,7 +92,7 @@
           <w:i w:val="0"/>
           <w:sz w:val="22"/>
         </w:rPr>
-        <w:t>Bei gesichertem Lynch-Syndrom empfehlen wir die tägliche Einnahme von ASS 100 mg (enteric coated) zur Chemoprävention des kolorektalen Karzinoms. Bitte ggf. mit dem weiterbehandelnden Arzt besprechen.</w:t>
+        <w:t>Bei gesichertem Lynch-Syndrom empfehlen wir die tägliche Einnahme von ASS 75–100 mg (enteric coated) zur Chemoprävention des kolorektalen Karzinoms. Bitte ggf. mit dem weiterbehandelnden Arzt besprechen.</w:t>
       </w:r>
     </w:p>
     <w:p>
@@ -158,6 +158,32 @@
           <w:sz w:val="22"/>
         </w:rPr>
         <w:t>Bei Nachweis einer MSH2-Mutation empfehlen wir ein Screening auf Helicobacter pylori sowie eine Eradikation bei positivem Nachweis, da MSH2-Träger ein erhöhtes Risiko für Magenkarzinome aufweisen.</w:t>
+      </w:r>
+    </w:p>
+    <w:p>
+      <w:pPr>
+        <w:spacing w:before="120" w:after="40"/>
+      </w:pPr>
+      <w:r>
+        <w:rPr>
+          <w:b/>
+          <w:i w:val="0"/>
+          <w:sz w:val="22"/>
+        </w:rPr>
+        <w:t>4.  Pankreaskarzinom-Risiko</w:t>
+      </w:r>
+    </w:p>
+    <w:p>
+      <w:pPr>
+        <w:spacing w:before="0" w:after="200"/>
+      </w:pPr>
+      <w:r>
+        <w:rPr>
+          <w:b w:val="0"/>
+          <w:i w:val="0"/>
+          <w:sz w:val="22"/>
+        </w:rPr>
+        <w:t>Lynch-Träger (insbesondere MLH1- und MSH2-Mutation) haben ein moderat erhöhtes Risiko für ein Pankreaskarzinom. Bei positiver Pankreas-Familienanamnese empfehlen wir eine individuelle Risikoberatung und ggf. Surveillance nach Maßgabe eines spezialisierten Zentrums.</w:t>
       </w:r>
     </w:p>
     <w:p>

</xml_diff>